<commit_message>
docs: adenda de dominio Fases 50–51 (naturaleza + saldo inicial)
- Docs/ADENDA-dominio-fases-50-51.md: prosa para DDD §T y DATABASE_DESIGN
  cubriendo naturaleza (G28) y SALDO_INICIAL (G29). Renombra la adenda previa
  de naturaleza.
- DDD.docx / DATABASE_DESIGN.docx: bloque "Adenda Fases 50–51" anexado al final
  del cuerpo (verificado con LibreOffice).

Co-Authored-By: Claude Sonnet 5 <noreply@anthropic.com>
</commit_message>
<xml_diff>
--- a/Docs/DATABASE_DESIGN.docx
+++ b/Docs/DATABASE_DESIGN.docx
@@ -5199,6 +5199,59 @@
       </w:r>
     </w:p>
     <w:bookmarkEnd w:id="34"/>
+    <w:p>
+      <w:r>
+        <w:rPr>
+          <w:b/>
+          <w:bCs/>
+        </w:rPr>
+        <w:t xml:space="preserve">Adenda Fases 50–51 (anexada automáticamente — ver Docs/ADENDA-dominio-fases-50-51.md)</w:t>
+      </w:r>
+    </w:p>
+    <w:p>
+      <w:r>
+        <w:t xml:space="preserve">Tabla elemento_patrimonial — nueva columna:</w:t>
+      </w:r>
+    </w:p>
+    <w:p>
+      <w:r>
+        <w:t xml:space="preserve">naturaleza  TEXT  NULL salvo DEUDA/CREDITO — Naturaleza de una deuda/crédito: FINANCIERA (crédito/préstamo real) o CUSTODIA_INFORMAL (dinero de un tercero que solo pasa por las cuentas). Obligatoria para categoria_funcional IN ('DEUDA','CREDITO') — por defecto 'FINANCIERA'; NULL en el resto.</w:t>
+      </w:r>
+    </w:p>
+    <w:p>
+      <w:r>
+        <w:rPr>
+          <w:rFonts w:ascii="Consolas" w:hAnsi="Consolas"/>
+        </w:rPr>
+        <w:t xml:space="preserve">CHECK ck_naturaleza_valores: naturaleza IS NULL OR naturaleza IN ('FINANCIERA','CUSTODIA_INFORMAL'). CHECK ck_naturaleza_categoria: (categoria_funcional IN ('DEUDA','CREDITO') AND naturaleza IS NOT NULL) OR (categoria_funcional NOT IN ('DEUDA','CREDITO') AND naturaleza IS NULL). Migración 023.</w:t>
+      </w:r>
+    </w:p>
+    <w:p>
+      <w:r>
+        <w:rPr>
+          <w:rFonts w:ascii="Consolas" w:hAnsi="Consolas"/>
+        </w:rPr>
+        <w:t xml:space="preserve">Backfill: UPDATE elemento_patrimonial SET naturaleza = 'FINANCIERA' WHERE categoria_funcional IN ('DEUDA','CREDITO') AND naturaleza IS NULL.</w:t>
+      </w:r>
+    </w:p>
+    <w:p>
+      <w:r>
+        <w:t xml:space="preserve">Tabla evento_financiero — columna tipo, dominio ampliado (migración 024):</w:t>
+      </w:r>
+    </w:p>
+    <w:p>
+      <w:r>
+        <w:rPr>
+          <w:rFonts w:ascii="Consolas" w:hAnsi="Consolas"/>
+        </w:rPr>
+        <w:t xml:space="preserve">CHECK (tipo IN ('INGRESO','GASTO','TRANSFERENCIA','CONVERSION','PRESTAMO','SALDO_INICIAL'))</w:t>
+      </w:r>
+    </w:p>
+    <w:p>
+      <w:r>
+        <w:t xml:space="preserve">SALDO_INICIAL — evento generado exclusivamente por RegistrarElementoPatrimonial para la apertura de una cuenta LIQUIDEZ/RESERVA. Un único impacto +valorInicial sobre el elemento recién creado, con fecha = fecha_alta. No editable por comandos de evento.</w:t>
+      </w:r>
+    </w:p>
     <w:sectPr/>
   </w:body>
 </w:document>

</xml_diff>